<commit_message>
Semana 7: matriz de consistencia, problema y objetivo general con el nivel de gestión que asigna la Matriz GEMSES
</commit_message>
<xml_diff>
--- a/entregables/semana7/Matriz_de_Consistencia_y_Operacionalizacion_CarlosPerez.docx
+++ b/entregables/semana7/Matriz_de_Consistencia_y_Operacionalizacion_CarlosPerez.docx
@@ -128,7 +128,7 @@
               <w:t xml:space="preserve"> </w:t>
             </w:r>
             <w:r>
-              <w:t xml:space="preserve">de procesamiento de lenguaje natural y aprendizaje automático, aplicado a las epicrisis de MIMIC-IV, identifica los eventos adversos no registrados en la codificación y permite estimar el subregistro y priorizarlo con la Matriz GEMSES?</w:t>
+              <w:t xml:space="preserve">de procesamiento de lenguaje natural y aprendizaje automático, aplicado a las epicrisis de MIMIC-IV, identifica los eventos adversos no registrados en la codificación y permite estimar el subregistro, y qué nivel de gestión asigna la Matriz GEMSES a cada grupo de eventos confirmados?</w:t>
             </w:r>
           </w:p>
         </w:tc>
@@ -155,7 +155,7 @@
               <w:t xml:space="preserve"> </w:t>
             </w:r>
             <w:r>
-              <w:t xml:space="preserve">identifica en las epicrisis los eventos adversos no registrados en la codificación, de modo que se estime el subregistro y se priorice su gestión con la Matriz GEMSES, como base para reducirlo en sistemas sanitarios de habla hispana.</w:t>
+              <w:t xml:space="preserve">identifica en las epicrisis los eventos adversos no registrados en la codificación, para estimar el subregistro y asignar, con la Matriz GEMSES, el nivel de gestión de cada grupo de eventos confirmados según su frecuencia y su impacto, como base para reducir el subregistro en sistemas sanitarios de habla hispana.</w:t>
             </w:r>
           </w:p>
         </w:tc>
@@ -830,7 +830,7 @@
               <w:pStyle w:val="Compact"/>
             </w:pPr>
             <w:r>
-              <w:t xml:space="preserve">PE2. ¿Cuántas de las epicrisis sin código que el modelo marca como evento contienen al menos un evento adverso real no registrado, y qué prioridad de gestión tendrían?</w:t>
+              <w:t xml:space="preserve">PE2. ¿Cuántas de las epicrisis sin código que el modelo marca como evento contienen al menos un evento adverso real no registrado, y qué nivel de gestión corresponde a los grupos de eventos confirmados en ellas?</w:t>
             </w:r>
           </w:p>
         </w:tc>
@@ -1819,7 +1819,7 @@
               <w:pStyle w:val="Compact"/>
             </w:pPr>
             <w:r>
-              <w:t xml:space="preserve">Para cada evento confirmado, el impacto es la suma ponderada de sus valoraciones del Anexo N.° 02, en la escala de 9, 6, 3, 1 y 0 del num. 19.11 b, aunque el anexo contiene algunos valores fuera de esa escala; el valor de riesgo es el índice de frecuencia por el impacto y el índice de gestión es el valor de riesgo entre la suma de los valores de riesgo; las bandas son verde por debajo del percentil 25 del índice de gestión, amarillo entre los percentiles 25 y 75 y rojo por encima del 75 y, con menos de ocho eventos distintos, un corte absoluto sobre el impacto, regla que es una decisión del autor, dado que el num. 19.12 no fija los rangos</w:t>
+              <w:t xml:space="preserve">Los eventos confirmados se agrupan por su ID del Anexo N.° 02 (num. 19.9); para cada grupo, el impacto es la suma ponderada de sus valoraciones del Anexo N.° 02, en la escala de 9, 6, 3, 1 y 0 del num. 19.11 b, aunque el anexo contiene algunos valores fuera de esa escala; el valor de riesgo es el índice de frecuencia por el impacto, y el índice de frecuencia se calcula sobre los eventos confirmados de la muestra, no por proceso ni por semestre (num. 19.11 a) y el índice de gestión es el valor de riesgo entre la suma de los valores de riesgo; las bandas son verde por debajo del percentil 25 del índice de gestión, amarillo entre los percentiles 25 y 75 y rojo por encima del 75 y, con menos de ocho ID de evento distintos, un corte absoluto sobre el impacto, regla que es una decisión del autor, dado que el num. 19.12 no fija los rangos</w:t>
             </w:r>
           </w:p>
         </w:tc>

</xml_diff>